<commit_message>
add readme & requirment.txt
</commit_message>
<xml_diff>
--- a/guide.docx
+++ b/guide.docx
@@ -515,6 +515,483 @@
           <w:szCs w:val="26"/>
         </w:rPr>
       </w:pPr>
+    </w:p>
+    <w:p>
+      <w:pPr>
+        <w:rPr>
+          <w:rFonts w:hint="default" w:ascii="Times New Roman" w:hAnsi="Times New Roman"/>
+          <w:sz w:val="26"/>
+          <w:szCs w:val="26"/>
+        </w:rPr>
+      </w:pPr>
+      <w:r>
+        <w:rPr>
+          <w:rFonts w:hint="default" w:ascii="Times New Roman" w:hAnsi="Times New Roman"/>
+          <w:sz w:val="26"/>
+          <w:szCs w:val="26"/>
+        </w:rPr>
+        <w:t>mysql -u root --port=3307</w:t>
+      </w:r>
+    </w:p>
+    <w:p>
+      <w:pPr>
+        <w:rPr>
+          <w:rFonts w:hint="default" w:ascii="Times New Roman" w:hAnsi="Times New Roman"/>
+          <w:sz w:val="26"/>
+          <w:szCs w:val="26"/>
+        </w:rPr>
+      </w:pPr>
+    </w:p>
+    <w:p>
+      <w:pPr>
+        <w:rPr>
+          <w:rFonts w:hint="default" w:ascii="Times New Roman" w:hAnsi="Times New Roman"/>
+          <w:sz w:val="26"/>
+          <w:szCs w:val="26"/>
+        </w:rPr>
+      </w:pPr>
+      <w:r>
+        <w:rPr>
+          <w:rFonts w:hint="default" w:ascii="Times New Roman" w:hAnsi="Times New Roman"/>
+          <w:sz w:val="26"/>
+          <w:szCs w:val="26"/>
+        </w:rPr>
+        <w:t xml:space="preserve">INSERT INTO giaodich </w:t>
+      </w:r>
+    </w:p>
+    <w:p>
+      <w:pPr>
+        <w:rPr>
+          <w:rFonts w:hint="default" w:ascii="Times New Roman" w:hAnsi="Times New Roman"/>
+          <w:sz w:val="26"/>
+          <w:szCs w:val="26"/>
+        </w:rPr>
+      </w:pPr>
+      <w:r>
+        <w:rPr>
+          <w:rFonts w:hint="default" w:ascii="Times New Roman" w:hAnsi="Times New Roman"/>
+          <w:sz w:val="26"/>
+          <w:szCs w:val="26"/>
+        </w:rPr>
+        <w:t>(OrderID, BuyerID, SellerID, DiemTichLuy, PhanHoiDanhGia, ThoiGianNhanHangDuKien, ThoiGianNhanHangThucTe, TrangThaiGiaoDich)</w:t>
+      </w:r>
+    </w:p>
+    <w:p>
+      <w:pPr>
+        <w:rPr>
+          <w:rFonts w:hint="default" w:ascii="Times New Roman" w:hAnsi="Times New Roman"/>
+          <w:sz w:val="26"/>
+          <w:szCs w:val="26"/>
+        </w:rPr>
+      </w:pPr>
+      <w:r>
+        <w:rPr>
+          <w:rFonts w:hint="default" w:ascii="Times New Roman" w:hAnsi="Times New Roman"/>
+          <w:sz w:val="26"/>
+          <w:szCs w:val="26"/>
+        </w:rPr>
+        <w:t>VALUES</w:t>
+      </w:r>
+    </w:p>
+    <w:p>
+      <w:pPr>
+        <w:rPr>
+          <w:rFonts w:hint="default" w:ascii="Times New Roman" w:hAnsi="Times New Roman"/>
+          <w:sz w:val="26"/>
+          <w:szCs w:val="26"/>
+        </w:rPr>
+      </w:pPr>
+      <w:r>
+        <w:rPr>
+          <w:rFonts w:hint="default" w:ascii="Times New Roman" w:hAnsi="Times New Roman"/>
+          <w:sz w:val="26"/>
+          <w:szCs w:val="26"/>
+        </w:rPr>
+        <w:t>(</w:t>
+      </w:r>
+      <w:r>
+        <w:rPr>
+          <w:rFonts w:hint="default" w:ascii="Times New Roman" w:hAnsi="Times New Roman"/>
+          <w:sz w:val="26"/>
+          <w:szCs w:val="26"/>
+          <w:lang w:val="en-US"/>
+        </w:rPr>
+        <w:t>2</w:t>
+      </w:r>
+      <w:r>
+        <w:rPr>
+          <w:rFonts w:hint="default" w:ascii="Times New Roman" w:hAnsi="Times New Roman"/>
+          <w:sz w:val="26"/>
+          <w:szCs w:val="26"/>
+        </w:rPr>
+        <w:t>, 1</w:t>
+      </w:r>
+      <w:r>
+        <w:rPr>
+          <w:rFonts w:hint="default" w:ascii="Times New Roman" w:hAnsi="Times New Roman"/>
+          <w:sz w:val="26"/>
+          <w:szCs w:val="26"/>
+          <w:lang w:val="en-US"/>
+        </w:rPr>
+        <w:t>1</w:t>
+      </w:r>
+      <w:r>
+        <w:rPr>
+          <w:rFonts w:hint="default" w:ascii="Times New Roman" w:hAnsi="Times New Roman"/>
+          <w:sz w:val="26"/>
+          <w:szCs w:val="26"/>
+        </w:rPr>
+        <w:t xml:space="preserve">, </w:t>
+      </w:r>
+      <w:r>
+        <w:rPr>
+          <w:rFonts w:hint="default" w:ascii="Times New Roman" w:hAnsi="Times New Roman"/>
+          <w:sz w:val="26"/>
+          <w:szCs w:val="26"/>
+          <w:lang w:val="en-US"/>
+        </w:rPr>
+        <w:t>1</w:t>
+      </w:r>
+      <w:r>
+        <w:rPr>
+          <w:rFonts w:hint="default" w:ascii="Times New Roman" w:hAnsi="Times New Roman"/>
+          <w:sz w:val="26"/>
+          <w:szCs w:val="26"/>
+        </w:rPr>
+        <w:t>, 10, 'Sản phẩm tốt, giao nhanh.',        '2025-01-10', '2025-01-09', 'Hoàn thành'),</w:t>
+      </w:r>
+    </w:p>
+    <w:p>
+      <w:pPr>
+        <w:rPr>
+          <w:rFonts w:hint="default" w:ascii="Times New Roman" w:hAnsi="Times New Roman"/>
+          <w:sz w:val="26"/>
+          <w:szCs w:val="26"/>
+        </w:rPr>
+      </w:pPr>
+      <w:r>
+        <w:rPr>
+          <w:rFonts w:hint="default" w:ascii="Times New Roman" w:hAnsi="Times New Roman"/>
+          <w:sz w:val="26"/>
+          <w:szCs w:val="26"/>
+        </w:rPr>
+        <w:t>(</w:t>
+      </w:r>
+      <w:r>
+        <w:rPr>
+          <w:rFonts w:hint="default" w:ascii="Times New Roman" w:hAnsi="Times New Roman"/>
+          <w:sz w:val="26"/>
+          <w:szCs w:val="26"/>
+          <w:lang w:val="en-US"/>
+        </w:rPr>
+        <w:t>3</w:t>
+      </w:r>
+      <w:r>
+        <w:rPr>
+          <w:rFonts w:hint="default" w:ascii="Times New Roman" w:hAnsi="Times New Roman"/>
+          <w:sz w:val="26"/>
+          <w:szCs w:val="26"/>
+        </w:rPr>
+        <w:t xml:space="preserve">, </w:t>
+      </w:r>
+      <w:r>
+        <w:rPr>
+          <w:rFonts w:hint="default" w:ascii="Times New Roman" w:hAnsi="Times New Roman"/>
+          <w:sz w:val="26"/>
+          <w:szCs w:val="26"/>
+          <w:lang w:val="en-US"/>
+        </w:rPr>
+        <w:t>11</w:t>
+      </w:r>
+      <w:r>
+        <w:rPr>
+          <w:rFonts w:hint="default" w:ascii="Times New Roman" w:hAnsi="Times New Roman"/>
+          <w:sz w:val="26"/>
+          <w:szCs w:val="26"/>
+        </w:rPr>
+        <w:t xml:space="preserve">, </w:t>
+      </w:r>
+      <w:r>
+        <w:rPr>
+          <w:rFonts w:hint="default" w:ascii="Times New Roman" w:hAnsi="Times New Roman"/>
+          <w:sz w:val="26"/>
+          <w:szCs w:val="26"/>
+          <w:lang w:val="en-US"/>
+        </w:rPr>
+        <w:t>8</w:t>
+      </w:r>
+      <w:r>
+        <w:rPr>
+          <w:rFonts w:hint="default" w:ascii="Times New Roman" w:hAnsi="Times New Roman"/>
+          <w:sz w:val="26"/>
+          <w:szCs w:val="26"/>
+        </w:rPr>
+        <w:t>,  5, 'Đúng mô tả, hơi chậm 1 chút.',      '2025-01-12', '2025-01-13', 'Hoàn thành'),</w:t>
+      </w:r>
+    </w:p>
+    <w:p>
+      <w:pPr>
+        <w:rPr>
+          <w:rFonts w:hint="default" w:ascii="Times New Roman" w:hAnsi="Times New Roman"/>
+          <w:sz w:val="26"/>
+          <w:szCs w:val="26"/>
+        </w:rPr>
+      </w:pPr>
+      <w:r>
+        <w:rPr>
+          <w:rFonts w:hint="default" w:ascii="Times New Roman" w:hAnsi="Times New Roman"/>
+          <w:sz w:val="26"/>
+          <w:szCs w:val="26"/>
+        </w:rPr>
+        <w:t>(</w:t>
+      </w:r>
+      <w:r>
+        <w:rPr>
+          <w:rFonts w:hint="default" w:ascii="Times New Roman" w:hAnsi="Times New Roman"/>
+          <w:sz w:val="26"/>
+          <w:szCs w:val="26"/>
+          <w:lang w:val="en-US"/>
+        </w:rPr>
+        <w:t>4</w:t>
+      </w:r>
+      <w:r>
+        <w:rPr>
+          <w:rFonts w:hint="default" w:ascii="Times New Roman" w:hAnsi="Times New Roman"/>
+          <w:sz w:val="26"/>
+          <w:szCs w:val="26"/>
+        </w:rPr>
+        <w:t xml:space="preserve">, </w:t>
+      </w:r>
+      <w:r>
+        <w:rPr>
+          <w:rFonts w:hint="default" w:ascii="Times New Roman" w:hAnsi="Times New Roman"/>
+          <w:sz w:val="26"/>
+          <w:szCs w:val="26"/>
+          <w:lang w:val="en-US"/>
+        </w:rPr>
+        <w:t>5</w:t>
+      </w:r>
+      <w:r>
+        <w:rPr>
+          <w:rFonts w:hint="default" w:ascii="Times New Roman" w:hAnsi="Times New Roman"/>
+          <w:sz w:val="26"/>
+          <w:szCs w:val="26"/>
+        </w:rPr>
+        <w:t xml:space="preserve">, </w:t>
+      </w:r>
+      <w:r>
+        <w:rPr>
+          <w:rFonts w:hint="default" w:ascii="Times New Roman" w:hAnsi="Times New Roman"/>
+          <w:sz w:val="26"/>
+          <w:szCs w:val="26"/>
+          <w:lang w:val="en-US"/>
+        </w:rPr>
+        <w:t>8</w:t>
+      </w:r>
+      <w:r>
+        <w:rPr>
+          <w:rFonts w:hint="default" w:ascii="Times New Roman" w:hAnsi="Times New Roman"/>
+          <w:sz w:val="26"/>
+          <w:szCs w:val="26"/>
+        </w:rPr>
+        <w:t>,  8, NULL,                                '2025-01-15', NULL,         'Đang giao'),</w:t>
+      </w:r>
+    </w:p>
+    <w:p>
+      <w:pPr>
+        <w:rPr>
+          <w:rFonts w:hint="default" w:ascii="Times New Roman" w:hAnsi="Times New Roman"/>
+          <w:sz w:val="26"/>
+          <w:szCs w:val="26"/>
+        </w:rPr>
+      </w:pPr>
+      <w:r>
+        <w:rPr>
+          <w:rFonts w:hint="default" w:ascii="Times New Roman" w:hAnsi="Times New Roman"/>
+          <w:sz w:val="26"/>
+          <w:szCs w:val="26"/>
+        </w:rPr>
+        <w:t>(</w:t>
+      </w:r>
+      <w:r>
+        <w:rPr>
+          <w:rFonts w:hint="default" w:ascii="Times New Roman" w:hAnsi="Times New Roman"/>
+          <w:sz w:val="26"/>
+          <w:szCs w:val="26"/>
+          <w:lang w:val="en-US"/>
+        </w:rPr>
+        <w:t>5</w:t>
+      </w:r>
+      <w:r>
+        <w:rPr>
+          <w:rFonts w:hint="default" w:ascii="Times New Roman" w:hAnsi="Times New Roman"/>
+          <w:sz w:val="26"/>
+          <w:szCs w:val="26"/>
+        </w:rPr>
+        <w:t xml:space="preserve">, </w:t>
+      </w:r>
+      <w:r>
+        <w:rPr>
+          <w:rFonts w:hint="default" w:ascii="Times New Roman" w:hAnsi="Times New Roman"/>
+          <w:sz w:val="26"/>
+          <w:szCs w:val="26"/>
+          <w:lang w:val="en-US"/>
+        </w:rPr>
+        <w:t>5</w:t>
+      </w:r>
+      <w:r>
+        <w:rPr>
+          <w:rFonts w:hint="default" w:ascii="Times New Roman" w:hAnsi="Times New Roman"/>
+          <w:sz w:val="26"/>
+          <w:szCs w:val="26"/>
+        </w:rPr>
+        <w:t xml:space="preserve">, </w:t>
+      </w:r>
+      <w:r>
+        <w:rPr>
+          <w:rFonts w:hint="default" w:ascii="Times New Roman" w:hAnsi="Times New Roman"/>
+          <w:sz w:val="26"/>
+          <w:szCs w:val="26"/>
+          <w:lang w:val="en-US"/>
+        </w:rPr>
+        <w:t>1</w:t>
+      </w:r>
+      <w:r>
+        <w:rPr>
+          <w:rFonts w:hint="default" w:ascii="Times New Roman" w:hAnsi="Times New Roman"/>
+          <w:sz w:val="26"/>
+          <w:szCs w:val="26"/>
+        </w:rPr>
+        <w:t>,  0, NULL,                                '2025-01-20', NULL,         'Chờ xác nhận'),</w:t>
+      </w:r>
+    </w:p>
+    <w:p>
+      <w:pPr>
+        <w:rPr>
+          <w:rFonts w:hint="default" w:ascii="Times New Roman" w:hAnsi="Times New Roman"/>
+          <w:sz w:val="26"/>
+          <w:szCs w:val="26"/>
+        </w:rPr>
+      </w:pPr>
+      <w:r>
+        <w:rPr>
+          <w:rFonts w:hint="default" w:ascii="Times New Roman" w:hAnsi="Times New Roman"/>
+          <w:sz w:val="26"/>
+          <w:szCs w:val="26"/>
+        </w:rPr>
+        <w:t>(</w:t>
+      </w:r>
+      <w:r>
+        <w:rPr>
+          <w:rFonts w:hint="default" w:ascii="Times New Roman" w:hAnsi="Times New Roman"/>
+          <w:sz w:val="26"/>
+          <w:szCs w:val="26"/>
+          <w:lang w:val="en-US"/>
+        </w:rPr>
+        <w:t>6</w:t>
+      </w:r>
+      <w:r>
+        <w:rPr>
+          <w:rFonts w:hint="default" w:ascii="Times New Roman" w:hAnsi="Times New Roman"/>
+          <w:sz w:val="26"/>
+          <w:szCs w:val="26"/>
+        </w:rPr>
+        <w:t xml:space="preserve">, </w:t>
+      </w:r>
+      <w:r>
+        <w:rPr>
+          <w:rFonts w:hint="default" w:ascii="Times New Roman" w:hAnsi="Times New Roman"/>
+          <w:sz w:val="26"/>
+          <w:szCs w:val="26"/>
+          <w:lang w:val="en-US"/>
+        </w:rPr>
+        <w:t>13</w:t>
+      </w:r>
+      <w:r>
+        <w:rPr>
+          <w:rFonts w:hint="default" w:ascii="Times New Roman" w:hAnsi="Times New Roman"/>
+          <w:sz w:val="26"/>
+          <w:szCs w:val="26"/>
+        </w:rPr>
+        <w:t xml:space="preserve">, </w:t>
+      </w:r>
+      <w:r>
+        <w:rPr>
+          <w:rFonts w:hint="default" w:ascii="Times New Roman" w:hAnsi="Times New Roman"/>
+          <w:sz w:val="26"/>
+          <w:szCs w:val="26"/>
+          <w:lang w:val="en-US"/>
+        </w:rPr>
+        <w:t>1,</w:t>
+      </w:r>
+      <w:r>
+        <w:rPr>
+          <w:rFonts w:hint="default" w:ascii="Times New Roman" w:hAnsi="Times New Roman"/>
+          <w:sz w:val="26"/>
+          <w:szCs w:val="26"/>
+        </w:rPr>
+        <w:t xml:space="preserve"> 12, 'Rất hài lòng, đóng gói đẹp.',       '2025-01-18', '2025-01-18', 'Hoàn thành');</w:t>
+      </w:r>
+    </w:p>
+    <w:p>
+      <w:pPr>
+        <w:rPr>
+          <w:rFonts w:hint="default" w:ascii="Times New Roman" w:hAnsi="Times New Roman"/>
+          <w:sz w:val="26"/>
+          <w:szCs w:val="26"/>
+        </w:rPr>
+      </w:pPr>
+    </w:p>
+    <w:p>
+      <w:pPr>
+        <w:rPr>
+          <w:rFonts w:hint="default" w:ascii="Times New Roman" w:hAnsi="Times New Roman"/>
+          <w:sz w:val="26"/>
+          <w:szCs w:val="26"/>
+        </w:rPr>
+      </w:pPr>
+      <w:r>
+        <w:rPr>
+          <w:rFonts w:hint="default" w:ascii="Times New Roman" w:hAnsi="Times New Roman"/>
+          <w:sz w:val="26"/>
+          <w:szCs w:val="26"/>
+        </w:rPr>
+        <w:t>cd frontend</w:t>
+      </w:r>
+    </w:p>
+    <w:p>
+      <w:pPr>
+        <w:rPr>
+          <w:rFonts w:hint="default" w:ascii="Times New Roman" w:hAnsi="Times New Roman"/>
+          <w:sz w:val="26"/>
+          <w:szCs w:val="26"/>
+        </w:rPr>
+      </w:pPr>
+      <w:r>
+        <w:rPr>
+          <w:rFonts w:hint="default" w:ascii="Times New Roman" w:hAnsi="Times New Roman"/>
+          <w:sz w:val="26"/>
+          <w:szCs w:val="26"/>
+        </w:rPr>
+        <w:t>npm run dev</w:t>
+      </w:r>
+    </w:p>
+    <w:p>
+      <w:pPr>
+        <w:rPr>
+          <w:rFonts w:hint="default" w:ascii="Times New Roman" w:hAnsi="Times New Roman"/>
+          <w:sz w:val="26"/>
+          <w:szCs w:val="26"/>
+        </w:rPr>
+      </w:pPr>
+      <w:r>
+        <w:rPr>
+          <w:rFonts w:hint="default" w:ascii="Times New Roman" w:hAnsi="Times New Roman"/>
+          <w:sz w:val="26"/>
+          <w:szCs w:val="26"/>
+        </w:rPr>
+        <w:t>cd backend</w:t>
+      </w:r>
       <w:bookmarkStart w:id="0" w:name="_GoBack"/>
       <w:bookmarkEnd w:id="0"/>
     </w:p>
@@ -532,7 +1009,7 @@
           <w:sz w:val="26"/>
           <w:szCs w:val="26"/>
         </w:rPr>
-        <w:t>mysql -u root --port=3307</w:t>
+        <w:t>uvicorn main:app --reload</w:t>
       </w:r>
     </w:p>
     <w:sectPr>

</xml_diff>